<commit_message>
Trasnformation and first tests done
</commit_message>
<xml_diff>
--- a/Dipomski rad.docx
+++ b/Dipomski rad.docx
@@ -1835,33 +1835,6 @@
       </w:r>
     </w:p>
     <w:p>
-      <w:pPr>
-        <w:pStyle w:val="ListParagraph"/>
-        <w:ind w:left="1080"/>
-        <w:rPr>
-          <w:i/>
-          <w:lang w:val="sr-Latn-RS"/>
-        </w:rPr>
-      </w:pPr>
-    </w:p>
-    <w:p>
-      <w:pPr>
-        <w:pStyle w:val="ListParagraph"/>
-        <w:ind w:left="1080"/>
-        <w:rPr>
-          <w:i/>
-          <w:lang w:val="sr-Latn-RS"/>
-        </w:rPr>
-      </w:pPr>
-      <w:r>
-        <w:rPr>
-          <w:i/>
-          <w:lang w:val="sr-Latn-RS"/>
-        </w:rPr>
-        <w:t>Slika 2.1: Primeri slika iz skupa SipakMed (dodati nakon pripreme podataka).</w:t>
-      </w:r>
-    </w:p>
-    <w:p>
       <w:r>
         <w:rPr>
           <w:noProof/>
@@ -2496,6 +2469,12 @@
         </w:rPr>
         <w:t>Slika 2.4: Primer distribucije ciljnih klasa za thyroid recurrence (dodati nakon profilisanja).</w:t>
       </w:r>
+      <w:r>
+        <w:rPr>
+          <w:lang w:val="it-IT"/>
+        </w:rPr>
+        <w:br w:type="page"/>
+      </w:r>
     </w:p>
     <w:p>
       <w:pPr>
@@ -2507,18 +2486,622 @@
     </w:p>
     <w:p>
       <w:pPr>
-        <w:rPr>
-          <w:lang w:val="sr-Latn-RS"/>
-        </w:rPr>
-      </w:pPr>
-    </w:p>
-    <w:p>
-      <w:pPr>
-        <w:ind w:left="360"/>
-        <w:rPr>
-          <w:lang w:val="sr-Latn-RS"/>
-        </w:rPr>
-      </w:pPr>
+        <w:pStyle w:val="Heading1"/>
+        <w:numPr>
+          <w:ilvl w:val="0"/>
+          <w:numId w:val="1"/>
+        </w:numPr>
+        <w:rPr>
+          <w:lang w:val="sr-Latn-RS"/>
+        </w:rPr>
+      </w:pPr>
+      <w:r>
+        <w:rPr>
+          <w:lang w:val="sr-Latn-RS"/>
+        </w:rPr>
+        <w:t>Priprema podataka</w:t>
+      </w:r>
+    </w:p>
+    <w:p>
+      <w:pPr>
+        <w:rPr>
+          <w:lang w:val="sr-Latn-RS"/>
+        </w:rPr>
+      </w:pPr>
+      <w:r>
+        <w:rPr>
+          <w:lang w:val="sr-Latn-RS"/>
+        </w:rPr>
+        <w:t>Za sve skupove podataka korišćen je isti način podele na trening, validacioni i test skup u odnosu 70% / 15% / 15%</w:t>
+      </w:r>
+      <w:r>
+        <w:rPr>
+          <w:lang w:val="sr-Latn-RS"/>
+        </w:rPr>
+        <w:t xml:space="preserve"> </w:t>
+      </w:r>
+      <w:r>
+        <w:rPr>
+          <w:lang w:val="sr-Latn-RS"/>
+        </w:rPr>
+        <w:t xml:space="preserve"> Podela je rađena stratifikovano, što znači da se u sva tri dela zadržava približno isti odnos klasa kao u celom skupu.</w:t>
+      </w:r>
+    </w:p>
+    <w:p>
+      <w:pPr>
+        <w:rPr>
+          <w:lang w:val="sr-Latn-RS"/>
+        </w:rPr>
+      </w:pPr>
+      <w:r>
+        <w:rPr>
+          <w:lang w:val="sr-Latn-RS"/>
+        </w:rPr>
+        <w:t>Korišćen je seed = 42 da bi podela svaki put ispala ista kada se kod ponovo pokrene. Za svaki dataset čuvamo train.csv, val.csv, test.csv i meta.json, gde su zapisane osnovne brojke (broj uzoraka, raspodela klasa i veličine splitova). Kod SipakMed-a korišćen je podfolder CROPPED (kropovane slike), dok je kod tabelarnog skupa (thyroid) pre podele uklonjeno 19 dupliranih redova.</w:t>
+      </w:r>
+    </w:p>
+    <w:p>
+      <w:pPr>
+        <w:pStyle w:val="Heading2"/>
+        <w:rPr>
+          <w:lang w:val="sr-Latn-RS"/>
+        </w:rPr>
+      </w:pPr>
+      <w:r>
+        <w:rPr>
+          <w:lang w:val="sr-Latn-RS"/>
+        </w:rPr>
+        <w:t>3.1 Priprema tabular skupa Thyroid recurrence.</w:t>
+      </w:r>
+    </w:p>
+    <w:p>
+      <w:pPr>
+        <w:rPr>
+          <w:lang w:val="sr-Latn-RS"/>
+        </w:rPr>
+      </w:pPr>
+      <w:r>
+        <w:rPr>
+          <w:lang w:val="sr-Latn-RS"/>
+        </w:rPr>
+        <w:t>Skup podataka thyroid_recurrence sadrži 383 red</w:t>
+      </w:r>
+      <w:r>
+        <w:rPr>
+          <w:lang w:val="sr-Latn-RS"/>
+        </w:rPr>
+        <w:t>ova</w:t>
+      </w:r>
+      <w:r>
+        <w:rPr>
+          <w:lang w:val="sr-Latn-RS"/>
+        </w:rPr>
+        <w:t xml:space="preserve"> i 17 kolona (jedna od kolona je ciljna kolona Recurred). Tokom analize podataka primetili smo da postoje duplirani redovi</w:t>
+      </w:r>
+      <w:r>
+        <w:rPr>
+          <w:lang w:val="sr-Latn-RS"/>
+        </w:rPr>
+        <w:t>. P</w:t>
+      </w:r>
+      <w:r>
+        <w:rPr>
+          <w:lang w:val="sr-Latn-RS"/>
+        </w:rPr>
+        <w:t>ronađeno je 19 duplikata, pa je nakon uklanjanja duplikata ostalo 364 jedinstvena reda.</w:t>
+      </w:r>
+    </w:p>
+    <w:p>
+      <w:pPr>
+        <w:rPr>
+          <w:lang w:val="sr-Latn-RS"/>
+        </w:rPr>
+      </w:pPr>
+      <w:r>
+        <w:rPr>
+          <w:lang w:val="sr-Latn-RS"/>
+        </w:rPr>
+        <w:t>Zatim smo proverili da li u tabeli postoje prazne</w:t>
+      </w:r>
+      <w:r>
+        <w:rPr>
+          <w:lang w:val="sr-Latn-RS"/>
+        </w:rPr>
+        <w:t xml:space="preserve"> </w:t>
+      </w:r>
+      <w:r>
+        <w:rPr>
+          <w:lang w:val="sr-Latn-RS"/>
+        </w:rPr>
+        <w:t>vrednosti u kolonama.</w:t>
+      </w:r>
+      <w:r>
+        <w:rPr>
+          <w:lang w:val="sr-Latn-RS"/>
+        </w:rPr>
+        <w:t xml:space="preserve"> </w:t>
+      </w:r>
+      <w:r>
+        <w:rPr>
+          <w:lang w:val="sr-Latn-RS"/>
+        </w:rPr>
+        <w:t>Rezultat je da nema praznih polja, što znači da nije bilo potrebe za dodatnim popunjavanjem ili izbacivanjem redova zbog praznih podataka.</w:t>
+      </w:r>
+    </w:p>
+    <w:p>
+      <w:pPr>
+        <w:rPr>
+          <w:lang w:val="sr-Latn-RS"/>
+        </w:rPr>
+      </w:pPr>
+      <w:r>
+        <w:rPr>
+          <w:lang w:val="sr-Latn-RS"/>
+        </w:rPr>
+        <w:t xml:space="preserve">Kolona Recurred predstavlja cilj koji kasnije pokušavamo da predvidimo: da li je kod pacijenta došlo do povratka bolesti ili nije. Nakon čišćenja, raspodela je No = 256 i Yes = 108, što znači da klase nisu potpuno izbalansirane </w:t>
+      </w:r>
+      <w:r>
+        <w:rPr>
+          <w:lang w:val="sr-Latn-RS"/>
+        </w:rPr>
+        <w:t xml:space="preserve">jer </w:t>
+      </w:r>
+      <w:r>
+        <w:rPr>
+          <w:lang w:val="sr-Latn-RS"/>
+        </w:rPr>
+        <w:t>ima više primera “No” nego “Yes”.</w:t>
+      </w:r>
+    </w:p>
+    <w:p>
+      <w:pPr>
+        <w:rPr>
+          <w:lang w:val="sr-Latn-RS"/>
+        </w:rPr>
+      </w:pPr>
+      <w:r>
+        <w:rPr>
+          <w:lang w:val="sr-Latn-RS"/>
+        </w:rPr>
+        <w:t xml:space="preserve">Nakon podele na </w:t>
+      </w:r>
+      <w:r>
+        <w:rPr>
+          <w:lang w:val="sr-Latn-RS"/>
+        </w:rPr>
+        <w:t xml:space="preserve">trening, validacioni i test skup </w:t>
+      </w:r>
+      <w:r>
+        <w:rPr>
+          <w:lang w:val="sr-Latn-RS"/>
+        </w:rPr>
+        <w:t>dobili smo skupove</w:t>
+      </w:r>
+      <w:r>
+        <w:rPr>
+          <w:lang w:val="sr-Latn-RS"/>
+        </w:rPr>
+        <w:t>:</w:t>
+      </w:r>
+    </w:p>
+    <w:p>
+      <w:pPr>
+        <w:rPr>
+          <w:lang w:val="sr-Latn-RS"/>
+        </w:rPr>
+      </w:pPr>
+      <w:r>
+        <w:rPr>
+          <w:lang w:val="sr-Latn-RS"/>
+        </w:rPr>
+        <w:t>Train: 255 redova (No 179, Yes 76)</w:t>
+      </w:r>
+    </w:p>
+    <w:p>
+      <w:pPr>
+        <w:rPr>
+          <w:lang w:val="sr-Latn-RS"/>
+        </w:rPr>
+      </w:pPr>
+      <w:r>
+        <w:rPr>
+          <w:lang w:val="sr-Latn-RS"/>
+        </w:rPr>
+        <w:t>Val: 54 reda (No 38, Yes 16)</w:t>
+      </w:r>
+    </w:p>
+    <w:p>
+      <w:pPr>
+        <w:rPr>
+          <w:lang w:val="sr-Latn-RS"/>
+        </w:rPr>
+      </w:pPr>
+      <w:r>
+        <w:rPr>
+          <w:lang w:val="sr-Latn-RS"/>
+        </w:rPr>
+        <w:t>Test: 55 redova (No 39, Yes 16)</w:t>
+      </w:r>
+      <w:r>
+        <w:rPr>
+          <w:lang w:val="sr-Latn-RS"/>
+        </w:rPr>
+        <w:br w:type="page"/>
+      </w:r>
+    </w:p>
+    <w:p>
+      <w:pPr>
+        <w:pStyle w:val="Heading2"/>
+        <w:rPr>
+          <w:lang w:val="sr-Latn-RS"/>
+        </w:rPr>
+      </w:pPr>
+      <w:r>
+        <w:rPr>
+          <w:lang w:val="sr-Latn-RS"/>
+        </w:rPr>
+        <w:lastRenderedPageBreak/>
+        <w:t>3.2 Priprema image skupa LC25000</w:t>
+      </w:r>
+    </w:p>
+    <w:p>
+      <w:pPr>
+        <w:rPr>
+          <w:lang w:val="sr-Latn-RS"/>
+        </w:rPr>
+      </w:pPr>
+      <w:r>
+        <w:rPr>
+          <w:lang w:val="sr-Latn-RS"/>
+        </w:rPr>
+        <w:t>Skup podataka LC25000 sadrži ukupno 25.000 slika raspoređenih u dve klase: lung_image_sets = 15.000 i colon_image_sets = 10.000. Pošto je struktura organizovana po folderima (folder = klasa), najpre smo prošli kroz oba foldera i formirali listu parova (putanja do slike, naziv klase).</w:t>
+      </w:r>
+    </w:p>
+    <w:p>
+      <w:pPr>
+        <w:rPr>
+          <w:lang w:val="sr-Latn-RS"/>
+        </w:rPr>
+      </w:pPr>
+      <w:r>
+        <w:rPr>
+          <w:lang w:val="sr-Latn-RS"/>
+        </w:rPr>
+        <w:t xml:space="preserve">Nakon podele na </w:t>
+      </w:r>
+      <w:r>
+        <w:rPr>
+          <w:lang w:val="sr-Latn-RS"/>
+        </w:rPr>
+        <w:t xml:space="preserve">trening, validacioni i test skup </w:t>
+      </w:r>
+      <w:r>
+        <w:rPr>
+          <w:lang w:val="sr-Latn-RS"/>
+        </w:rPr>
+        <w:t>dobili smo skupove</w:t>
+      </w:r>
+      <w:r>
+        <w:rPr>
+          <w:lang w:val="sr-Latn-RS"/>
+        </w:rPr>
+        <w:t xml:space="preserve">: </w:t>
+      </w:r>
+    </w:p>
+    <w:p>
+      <w:pPr>
+        <w:rPr>
+          <w:lang w:val="sr-Latn-RS"/>
+        </w:rPr>
+      </w:pPr>
+      <w:r>
+        <w:rPr>
+          <w:lang w:val="sr-Latn-RS"/>
+        </w:rPr>
+        <w:t>T</w:t>
+      </w:r>
+      <w:r>
+        <w:rPr>
+          <w:lang w:val="sr-Latn-RS"/>
+        </w:rPr>
+        <w:t>rain = 17.500 (lung 10.500, colon 7.000)</w:t>
+      </w:r>
+    </w:p>
+    <w:p>
+      <w:pPr>
+        <w:rPr>
+          <w:lang w:val="sr-Latn-RS"/>
+        </w:rPr>
+      </w:pPr>
+      <w:r>
+        <w:rPr>
+          <w:lang w:val="sr-Latn-RS"/>
+        </w:rPr>
+        <w:t>V</w:t>
+      </w:r>
+      <w:r>
+        <w:rPr>
+          <w:lang w:val="sr-Latn-RS"/>
+        </w:rPr>
+        <w:t>al = 3.750 (lung 2.250, colon 1.500)</w:t>
+      </w:r>
+    </w:p>
+    <w:p>
+      <w:pPr>
+        <w:rPr>
+          <w:lang w:val="sr-Latn-RS"/>
+        </w:rPr>
+      </w:pPr>
+      <w:r>
+        <w:rPr>
+          <w:lang w:val="sr-Latn-RS"/>
+        </w:rPr>
+        <w:t>T</w:t>
+      </w:r>
+      <w:r>
+        <w:rPr>
+          <w:lang w:val="sr-Latn-RS"/>
+        </w:rPr>
+        <w:t>est = 3.750 (lung 2.250, colon 1.500)</w:t>
+      </w:r>
+    </w:p>
+    <w:p>
+      <w:pPr>
+        <w:jc w:val="left"/>
+        <w:rPr>
+          <w:lang w:val="sr-Latn-RS"/>
+        </w:rPr>
+      </w:pPr>
+      <w:r>
+        <w:rPr>
+          <w:lang w:val="sr-Latn-RS"/>
+        </w:rPr>
+        <w:br w:type="page"/>
+      </w:r>
+    </w:p>
+    <w:p>
+      <w:pPr>
+        <w:pStyle w:val="Heading2"/>
+        <w:rPr>
+          <w:lang w:val="sr-Latn-RS"/>
+        </w:rPr>
+      </w:pPr>
+      <w:r>
+        <w:rPr>
+          <w:lang w:val="sr-Latn-RS"/>
+        </w:rPr>
+        <w:lastRenderedPageBreak/>
+        <w:t>3.3 Priprema image skupa SipakMed</w:t>
+      </w:r>
+    </w:p>
+    <w:p>
+      <w:pPr>
+        <w:rPr>
+          <w:lang w:val="sr-Latn-RS"/>
+        </w:rPr>
+      </w:pPr>
+      <w:r>
+        <w:rPr>
+          <w:lang w:val="sr-Latn-RS"/>
+        </w:rPr>
+        <w:t>Skup podataka SipakMed je organizovan po folderima, gde svaki folder predstavlja jednu klasu. Za dalji rad korišćene su slike iz podfoldera CROPPED, jer predstavljaju isečene (kropovane) verzije uzoraka i fokusiraju se na deo slike koji je relevantan za analizu. Ukupno je izdvojeno 4049 slika raspoređenih u 5 klasa: im_Superficial-Intermediate = 831, im_Koilocytotic = 825, im_Dyskeratotic = 813, im_Metaplastic = 793, im_Parabasal = 787.</w:t>
+      </w:r>
+    </w:p>
+    <w:p>
+      <w:pPr>
+        <w:rPr>
+          <w:lang w:val="sr-Latn-RS"/>
+        </w:rPr>
+      </w:pPr>
+      <w:r>
+        <w:rPr>
+          <w:lang w:val="sr-Latn-RS"/>
+        </w:rPr>
+        <w:t>Nakon podele na</w:t>
+      </w:r>
+      <w:r>
+        <w:rPr>
+          <w:lang w:val="sr-Latn-RS"/>
+        </w:rPr>
+        <w:t xml:space="preserve"> trening, validacioni i test skup u odnosu </w:t>
+      </w:r>
+      <w:r>
+        <w:rPr>
+          <w:lang w:val="sr-Latn-RS"/>
+        </w:rPr>
+        <w:t>dobili smo skupove</w:t>
+      </w:r>
+      <w:r>
+        <w:rPr>
+          <w:lang w:val="sr-Latn-RS"/>
+        </w:rPr>
+        <w:t xml:space="preserve">: </w:t>
+      </w:r>
+    </w:p>
+    <w:p>
+      <w:pPr>
+        <w:rPr>
+          <w:lang w:val="sr-Latn-RS"/>
+        </w:rPr>
+      </w:pPr>
+      <w:r>
+        <w:rPr>
+          <w:lang w:val="sr-Latn-RS"/>
+        </w:rPr>
+        <w:t>T</w:t>
+      </w:r>
+      <w:r>
+        <w:rPr>
+          <w:lang w:val="sr-Latn-RS"/>
+        </w:rPr>
+        <w:t>rain = 2835</w:t>
+      </w:r>
+    </w:p>
+    <w:p>
+      <w:pPr>
+        <w:rPr>
+          <w:lang w:val="sr-Latn-RS"/>
+        </w:rPr>
+      </w:pPr>
+      <w:r>
+        <w:rPr>
+          <w:lang w:val="sr-Latn-RS"/>
+        </w:rPr>
+        <w:t>V</w:t>
+      </w:r>
+      <w:r>
+        <w:rPr>
+          <w:lang w:val="sr-Latn-RS"/>
+        </w:rPr>
+        <w:t>al = 608</w:t>
+      </w:r>
+    </w:p>
+    <w:p>
+      <w:pPr>
+        <w:rPr>
+          <w:lang w:val="sr-Latn-RS"/>
+        </w:rPr>
+      </w:pPr>
+      <w:r>
+        <w:rPr>
+          <w:lang w:val="sr-Latn-RS"/>
+        </w:rPr>
+        <w:t>T</w:t>
+      </w:r>
+      <w:r>
+        <w:rPr>
+          <w:lang w:val="sr-Latn-RS"/>
+        </w:rPr>
+        <w:t>est = 606</w:t>
+      </w:r>
+      <w:r>
+        <w:rPr>
+          <w:lang w:val="sr-Latn-RS"/>
+        </w:rPr>
+        <w:br w:type="page"/>
+      </w:r>
+    </w:p>
+    <w:p>
+      <w:pPr>
+        <w:pStyle w:val="Heading2"/>
+        <w:rPr>
+          <w:lang w:val="sr-Latn-RS"/>
+        </w:rPr>
+      </w:pPr>
+      <w:r>
+        <w:rPr>
+          <w:lang w:val="sr-Latn-RS"/>
+        </w:rPr>
+        <w:lastRenderedPageBreak/>
+        <w:t>3.4 Priprema image skupa RM1000.</w:t>
+      </w:r>
+    </w:p>
+    <w:p>
+      <w:pPr>
+        <w:rPr>
+          <w:lang w:val="sr-Latn-RS"/>
+        </w:rPr>
+      </w:pPr>
+      <w:r>
+        <w:rPr>
+          <w:lang w:val="sr-Latn-RS"/>
+        </w:rPr>
+        <w:t>Skup podataka RM1000 je organizovan po folderima, gde svaki folder predstavlja jednu klasu. Ukupno ima 15.000 slika, raspoređenih ravnomerno u tri klase: adenocarcinoma = 5.000, benign = 5.000 i squamous_cell_carcinoma = 5.000. Najpre smo prošli kroz sva tri foldera i formirali listu parova (putanja do slike, naziv klase).</w:t>
+      </w:r>
+    </w:p>
+    <w:p>
+      <w:pPr>
+        <w:rPr>
+          <w:lang w:val="sr-Latn-RS"/>
+        </w:rPr>
+      </w:pPr>
+      <w:r>
+        <w:rPr>
+          <w:lang w:val="sr-Latn-RS"/>
+        </w:rPr>
+        <w:t>Nakon podele na</w:t>
+      </w:r>
+      <w:r>
+        <w:rPr>
+          <w:lang w:val="sr-Latn-RS"/>
+        </w:rPr>
+        <w:t xml:space="preserve"> trening, validacioni i test skup u odnosu </w:t>
+      </w:r>
+      <w:r>
+        <w:rPr>
+          <w:lang w:val="sr-Latn-RS"/>
+        </w:rPr>
+        <w:t>dobili smo skupove</w:t>
+      </w:r>
+      <w:r>
+        <w:rPr>
+          <w:lang w:val="sr-Latn-RS"/>
+        </w:rPr>
+        <w:t xml:space="preserve">: </w:t>
+      </w:r>
+    </w:p>
+    <w:p>
+      <w:pPr>
+        <w:rPr>
+          <w:lang w:val="sr-Latn-RS"/>
+        </w:rPr>
+      </w:pPr>
+      <w:r>
+        <w:rPr>
+          <w:lang w:val="sr-Latn-RS"/>
+        </w:rPr>
+        <w:t>T</w:t>
+      </w:r>
+      <w:r>
+        <w:rPr>
+          <w:lang w:val="sr-Latn-RS"/>
+        </w:rPr>
+        <w:t>rain = 10.500 (3.500 po klasi)</w:t>
+      </w:r>
+    </w:p>
+    <w:p>
+      <w:pPr>
+        <w:rPr>
+          <w:lang w:val="sr-Latn-RS"/>
+        </w:rPr>
+      </w:pPr>
+      <w:r>
+        <w:rPr>
+          <w:lang w:val="sr-Latn-RS"/>
+        </w:rPr>
+        <w:t>V</w:t>
+      </w:r>
+      <w:r>
+        <w:rPr>
+          <w:lang w:val="sr-Latn-RS"/>
+        </w:rPr>
+        <w:t xml:space="preserve">al = 2.250 (750 po klasi) </w:t>
+      </w:r>
+    </w:p>
+    <w:p>
+      <w:pPr>
+        <w:rPr>
+          <w:lang w:val="sr-Latn-RS"/>
+        </w:rPr>
+      </w:pPr>
+      <w:r>
+        <w:rPr>
+          <w:lang w:val="sr-Latn-RS"/>
+        </w:rPr>
+        <w:t>T</w:t>
+      </w:r>
+      <w:r>
+        <w:rPr>
+          <w:lang w:val="sr-Latn-RS"/>
+        </w:rPr>
+        <w:t>est = 2.250 (750 po klasi</w:t>
+      </w:r>
+      <w:r>
+        <w:rPr>
+          <w:lang w:val="sr-Latn-RS"/>
+        </w:rPr>
+        <w:t>)</w:t>
+      </w:r>
     </w:p>
     <w:sectPr>
       <w:footerReference w:type="first" r:id="rId19"/>
@@ -3678,7 +4261,7 @@
   <w:style w:type="paragraph" w:default="1" w:styleId="Normal">
     <w:name w:val="Normal"/>
     <w:qFormat/>
-    <w:rsid w:val="002B1534"/>
+    <w:rsid w:val="0055343F"/>
     <w:pPr>
       <w:jc w:val="both"/>
     </w:pPr>
@@ -4322,6 +4905,16 @@
       <w:shd w:val="clear" w:color="auto" w:fill="E1DFDD"/>
     </w:rPr>
   </w:style>
+  <w:style w:type="character" w:styleId="PlaceholderText">
+    <w:name w:val="Placeholder Text"/>
+    <w:basedOn w:val="DefaultParagraphFont"/>
+    <w:uiPriority w:val="99"/>
+    <w:semiHidden/>
+    <w:rsid w:val="00F81986"/>
+    <w:rPr>
+      <w:color w:val="666666"/>
+    </w:rPr>
+  </w:style>
 </w:styles>
 </file>
 

</xml_diff>

<commit_message>
Word mala izmena dodata tabela jedna
</commit_message>
<xml_diff>
--- a/Dipomski rad.docx
+++ b/Dipomski rad.docx
@@ -3103,6 +3103,693 @@
         <w:t>)</w:t>
       </w:r>
     </w:p>
+    <w:p>
+      <w:pPr>
+        <w:jc w:val="left"/>
+        <w:rPr>
+          <w:lang w:val="sr-Latn-RS"/>
+        </w:rPr>
+      </w:pPr>
+      <w:r>
+        <w:rPr>
+          <w:lang w:val="sr-Latn-RS"/>
+        </w:rPr>
+        <w:br w:type="page"/>
+      </w:r>
+    </w:p>
+    <w:p>
+      <w:pPr>
+        <w:pStyle w:val="Heading1"/>
+        <w:numPr>
+          <w:ilvl w:val="0"/>
+          <w:numId w:val="1"/>
+        </w:numPr>
+        <w:rPr>
+          <w:lang w:val="sr-Latn-RS"/>
+        </w:rPr>
+      </w:pPr>
+      <w:r>
+        <w:rPr>
+          <w:lang w:val="sr-Latn-RS"/>
+        </w:rPr>
+        <w:lastRenderedPageBreak/>
+        <w:t>Baseline modeli i početni rezultati</w:t>
+      </w:r>
+    </w:p>
+    <w:p>
+      <w:pPr>
+        <w:rPr>
+          <w:lang w:val="sr-Latn-RS"/>
+        </w:rPr>
+      </w:pPr>
+      <w:r>
+        <w:rPr>
+          <w:lang w:val="sr-Latn-RS"/>
+        </w:rPr>
+        <w:t>U ovoj fazi trenirani su baseline modeli kako bi se dobila početna referenca performansi pre uvođenja složenijih arhitektura i dodatnih QC pravila. Za sve skupove korišćeni su već pripremljeni stratifikovani splitovi (70/15/15, seed=42), a rezultati se izveštavaju kroz accuracy i macro F1.</w:t>
+      </w:r>
+    </w:p>
+    <w:tbl>
+      <w:tblPr>
+        <w:tblW w:w="0" w:type="auto"/>
+        <w:tblCellSpacing w:w="15" w:type="dxa"/>
+        <w:tblCellMar>
+          <w:top w:w="15" w:type="dxa"/>
+          <w:left w:w="15" w:type="dxa"/>
+          <w:bottom w:w="15" w:type="dxa"/>
+          <w:right w:w="15" w:type="dxa"/>
+        </w:tblCellMar>
+        <w:tblLook w:val="04A0" w:firstRow="1" w:lastRow="0" w:firstColumn="1" w:lastColumn="0" w:noHBand="0" w:noVBand="1"/>
+      </w:tblPr>
+      <w:tblGrid>
+        <w:gridCol w:w="2295"/>
+        <w:gridCol w:w="1974"/>
+        <w:gridCol w:w="792"/>
+        <w:gridCol w:w="1594"/>
+        <w:gridCol w:w="871"/>
+        <w:gridCol w:w="1688"/>
+      </w:tblGrid>
+      <w:tr>
+        <w:trPr>
+          <w:tblHeader/>
+          <w:tblCellSpacing w:w="15" w:type="dxa"/>
+        </w:trPr>
+        <w:tc>
+          <w:tcPr>
+            <w:tcW w:w="0" w:type="auto"/>
+            <w:vAlign w:val="center"/>
+            <w:hideMark/>
+          </w:tcPr>
+          <w:p>
+            <w:pPr>
+              <w:rPr>
+                <w:b/>
+                <w:bCs/>
+              </w:rPr>
+            </w:pPr>
+            <w:r>
+              <w:rPr>
+                <w:b/>
+                <w:bCs/>
+              </w:rPr>
+              <w:t>Dataset</w:t>
+            </w:r>
+          </w:p>
+        </w:tc>
+        <w:tc>
+          <w:tcPr>
+            <w:tcW w:w="0" w:type="auto"/>
+            <w:vAlign w:val="center"/>
+            <w:hideMark/>
+          </w:tcPr>
+          <w:p>
+            <w:pPr>
+              <w:rPr>
+                <w:b/>
+                <w:bCs/>
+              </w:rPr>
+            </w:pPr>
+            <w:r>
+              <w:rPr>
+                <w:b/>
+                <w:bCs/>
+              </w:rPr>
+              <w:t>Model</w:t>
+            </w:r>
+          </w:p>
+        </w:tc>
+        <w:tc>
+          <w:tcPr>
+            <w:tcW w:w="0" w:type="auto"/>
+            <w:vAlign w:val="center"/>
+            <w:hideMark/>
+          </w:tcPr>
+          <w:p>
+            <w:pPr>
+              <w:rPr>
+                <w:b/>
+                <w:bCs/>
+              </w:rPr>
+            </w:pPr>
+            <w:r>
+              <w:rPr>
+                <w:b/>
+                <w:bCs/>
+              </w:rPr>
+              <w:t>Val acc</w:t>
+            </w:r>
+          </w:p>
+        </w:tc>
+        <w:tc>
+          <w:tcPr>
+            <w:tcW w:w="0" w:type="auto"/>
+            <w:vAlign w:val="center"/>
+            <w:hideMark/>
+          </w:tcPr>
+          <w:p>
+            <w:pPr>
+              <w:rPr>
+                <w:b/>
+                <w:bCs/>
+              </w:rPr>
+            </w:pPr>
+            <w:r>
+              <w:rPr>
+                <w:b/>
+                <w:bCs/>
+              </w:rPr>
+              <w:t>Val F1 (macro)</w:t>
+            </w:r>
+          </w:p>
+        </w:tc>
+        <w:tc>
+          <w:tcPr>
+            <w:tcW w:w="0" w:type="auto"/>
+            <w:vAlign w:val="center"/>
+            <w:hideMark/>
+          </w:tcPr>
+          <w:p>
+            <w:pPr>
+              <w:rPr>
+                <w:b/>
+                <w:bCs/>
+              </w:rPr>
+            </w:pPr>
+            <w:r>
+              <w:rPr>
+                <w:b/>
+                <w:bCs/>
+              </w:rPr>
+              <w:t>Test acc</w:t>
+            </w:r>
+          </w:p>
+        </w:tc>
+        <w:tc>
+          <w:tcPr>
+            <w:tcW w:w="0" w:type="auto"/>
+            <w:vAlign w:val="center"/>
+            <w:hideMark/>
+          </w:tcPr>
+          <w:p>
+            <w:pPr>
+              <w:rPr>
+                <w:b/>
+                <w:bCs/>
+              </w:rPr>
+            </w:pPr>
+            <w:r>
+              <w:rPr>
+                <w:b/>
+                <w:bCs/>
+              </w:rPr>
+              <w:t>Test F1 (macro)</w:t>
+            </w:r>
+          </w:p>
+        </w:tc>
+      </w:tr>
+      <w:tr>
+        <w:trPr>
+          <w:tblCellSpacing w:w="15" w:type="dxa"/>
+        </w:trPr>
+        <w:tc>
+          <w:tcPr>
+            <w:tcW w:w="0" w:type="auto"/>
+            <w:vAlign w:val="center"/>
+            <w:hideMark/>
+          </w:tcPr>
+          <w:p>
+            <w:proofErr w:type="spellStart"/>
+            <w:r>
+              <w:t>thyroid_recurrence</w:t>
+            </w:r>
+            <w:proofErr w:type="spellEnd"/>
+          </w:p>
+        </w:tc>
+        <w:tc>
+          <w:tcPr>
+            <w:tcW w:w="0" w:type="auto"/>
+            <w:vAlign w:val="center"/>
+            <w:hideMark/>
+          </w:tcPr>
+          <w:p>
+            <w:r>
+              <w:t>Logistic Regression</w:t>
+            </w:r>
+          </w:p>
+        </w:tc>
+        <w:tc>
+          <w:tcPr>
+            <w:tcW w:w="0" w:type="auto"/>
+            <w:vAlign w:val="center"/>
+            <w:hideMark/>
+          </w:tcPr>
+          <w:p>
+            <w:r>
+              <w:t>0.9259</w:t>
+            </w:r>
+          </w:p>
+        </w:tc>
+        <w:tc>
+          <w:tcPr>
+            <w:tcW w:w="0" w:type="auto"/>
+            <w:vAlign w:val="center"/>
+            <w:hideMark/>
+          </w:tcPr>
+          <w:p>
+            <w:r>
+              <w:t>0.9036</w:t>
+            </w:r>
+          </w:p>
+        </w:tc>
+        <w:tc>
+          <w:tcPr>
+            <w:tcW w:w="0" w:type="auto"/>
+            <w:vAlign w:val="center"/>
+            <w:hideMark/>
+          </w:tcPr>
+          <w:p>
+            <w:r>
+              <w:t>0.9455</w:t>
+            </w:r>
+          </w:p>
+        </w:tc>
+        <w:tc>
+          <w:tcPr>
+            <w:tcW w:w="0" w:type="auto"/>
+            <w:vAlign w:val="center"/>
+            <w:hideMark/>
+          </w:tcPr>
+          <w:p>
+            <w:r>
+              <w:t>0.9326</w:t>
+            </w:r>
+          </w:p>
+        </w:tc>
+      </w:tr>
+      <w:tr>
+        <w:trPr>
+          <w:tblCellSpacing w:w="15" w:type="dxa"/>
+        </w:trPr>
+        <w:tc>
+          <w:tcPr>
+            <w:tcW w:w="0" w:type="auto"/>
+            <w:vAlign w:val="center"/>
+            <w:hideMark/>
+          </w:tcPr>
+          <w:p>
+            <w:proofErr w:type="spellStart"/>
+            <w:r>
+              <w:t>thyroid_recurrence</w:t>
+            </w:r>
+            <w:proofErr w:type="spellEnd"/>
+          </w:p>
+        </w:tc>
+        <w:tc>
+          <w:tcPr>
+            <w:tcW w:w="0" w:type="auto"/>
+            <w:vAlign w:val="center"/>
+            <w:hideMark/>
+          </w:tcPr>
+          <w:p>
+            <w:proofErr w:type="spellStart"/>
+            <w:r>
+              <w:t>RandomForest</w:t>
+            </w:r>
+            <w:proofErr w:type="spellEnd"/>
+          </w:p>
+        </w:tc>
+        <w:tc>
+          <w:tcPr>
+            <w:tcW w:w="0" w:type="auto"/>
+            <w:vAlign w:val="center"/>
+            <w:hideMark/>
+          </w:tcPr>
+          <w:p>
+            <w:r>
+              <w:t>0.9630</w:t>
+            </w:r>
+          </w:p>
+        </w:tc>
+        <w:tc>
+          <w:tcPr>
+            <w:tcW w:w="0" w:type="auto"/>
+            <w:vAlign w:val="center"/>
+            <w:hideMark/>
+          </w:tcPr>
+          <w:p>
+            <w:r>
+              <w:t>0.9538</w:t>
+            </w:r>
+          </w:p>
+        </w:tc>
+        <w:tc>
+          <w:tcPr>
+            <w:tcW w:w="0" w:type="auto"/>
+            <w:vAlign w:val="center"/>
+            <w:hideMark/>
+          </w:tcPr>
+          <w:p>
+            <w:r>
+              <w:t>0.9818</w:t>
+            </w:r>
+          </w:p>
+        </w:tc>
+        <w:tc>
+          <w:tcPr>
+            <w:tcW w:w="0" w:type="auto"/>
+            <w:vAlign w:val="center"/>
+            <w:hideMark/>
+          </w:tcPr>
+          <w:p>
+            <w:r>
+              <w:t>0.9775</w:t>
+            </w:r>
+          </w:p>
+        </w:tc>
+      </w:tr>
+      <w:tr>
+        <w:trPr>
+          <w:tblCellSpacing w:w="15" w:type="dxa"/>
+        </w:trPr>
+        <w:tc>
+          <w:tcPr>
+            <w:tcW w:w="0" w:type="auto"/>
+            <w:vAlign w:val="center"/>
+            <w:hideMark/>
+          </w:tcPr>
+          <w:p>
+            <w:r>
+              <w:t>lc25000</w:t>
+            </w:r>
+          </w:p>
+        </w:tc>
+        <w:tc>
+          <w:tcPr>
+            <w:tcW w:w="0" w:type="auto"/>
+            <w:vAlign w:val="center"/>
+            <w:hideMark/>
+          </w:tcPr>
+          <w:p>
+            <w:r>
+              <w:t>ResNet18 (transfer)</w:t>
+            </w:r>
+          </w:p>
+        </w:tc>
+        <w:tc>
+          <w:tcPr>
+            <w:tcW w:w="0" w:type="auto"/>
+            <w:vAlign w:val="center"/>
+            <w:hideMark/>
+          </w:tcPr>
+          <w:p>
+            <w:r>
+              <w:t>1.0000</w:t>
+            </w:r>
+          </w:p>
+        </w:tc>
+        <w:tc>
+          <w:tcPr>
+            <w:tcW w:w="0" w:type="auto"/>
+            <w:vAlign w:val="center"/>
+            <w:hideMark/>
+          </w:tcPr>
+          <w:p>
+            <w:r>
+              <w:t>1.0000</w:t>
+            </w:r>
+          </w:p>
+        </w:tc>
+        <w:tc>
+          <w:tcPr>
+            <w:tcW w:w="0" w:type="auto"/>
+            <w:vAlign w:val="center"/>
+            <w:hideMark/>
+          </w:tcPr>
+          <w:p>
+            <w:r>
+              <w:t>1.0000</w:t>
+            </w:r>
+          </w:p>
+        </w:tc>
+        <w:tc>
+          <w:tcPr>
+            <w:tcW w:w="0" w:type="auto"/>
+            <w:vAlign w:val="center"/>
+            <w:hideMark/>
+          </w:tcPr>
+          <w:p>
+            <w:r>
+              <w:t>1.0000</w:t>
+            </w:r>
+          </w:p>
+        </w:tc>
+      </w:tr>
+      <w:tr>
+        <w:trPr>
+          <w:tblCellSpacing w:w="15" w:type="dxa"/>
+        </w:trPr>
+        <w:tc>
+          <w:tcPr>
+            <w:tcW w:w="0" w:type="auto"/>
+            <w:vAlign w:val="center"/>
+            <w:hideMark/>
+          </w:tcPr>
+          <w:p>
+            <w:proofErr w:type="spellStart"/>
+            <w:r>
+              <w:t>sipakmed</w:t>
+            </w:r>
+            <w:proofErr w:type="spellEnd"/>
+            <w:r>
+              <w:t xml:space="preserve"> (CROPPED)</w:t>
+            </w:r>
+          </w:p>
+        </w:tc>
+        <w:tc>
+          <w:tcPr>
+            <w:tcW w:w="0" w:type="auto"/>
+            <w:vAlign w:val="center"/>
+            <w:hideMark/>
+          </w:tcPr>
+          <w:p>
+            <w:r>
+              <w:t>ResNet18 (transfer)</w:t>
+            </w:r>
+          </w:p>
+        </w:tc>
+        <w:tc>
+          <w:tcPr>
+            <w:tcW w:w="0" w:type="auto"/>
+            <w:vAlign w:val="center"/>
+            <w:hideMark/>
+          </w:tcPr>
+          <w:p>
+            <w:r>
+              <w:t>0.9461</w:t>
+            </w:r>
+          </w:p>
+        </w:tc>
+        <w:tc>
+          <w:tcPr>
+            <w:tcW w:w="0" w:type="auto"/>
+            <w:vAlign w:val="center"/>
+            <w:hideMark/>
+          </w:tcPr>
+          <w:p>
+            <w:r>
+              <w:t>0.9461</w:t>
+            </w:r>
+          </w:p>
+        </w:tc>
+        <w:tc>
+          <w:tcPr>
+            <w:tcW w:w="0" w:type="auto"/>
+            <w:vAlign w:val="center"/>
+            <w:hideMark/>
+          </w:tcPr>
+          <w:p>
+            <w:r>
+              <w:t>0.9571</w:t>
+            </w:r>
+          </w:p>
+        </w:tc>
+        <w:tc>
+          <w:tcPr>
+            <w:tcW w:w="0" w:type="auto"/>
+            <w:vAlign w:val="center"/>
+            <w:hideMark/>
+          </w:tcPr>
+          <w:p>
+            <w:r>
+              <w:t>0.9573</w:t>
+            </w:r>
+          </w:p>
+        </w:tc>
+      </w:tr>
+      <w:tr>
+        <w:trPr>
+          <w:tblCellSpacing w:w="15" w:type="dxa"/>
+        </w:trPr>
+        <w:tc>
+          <w:tcPr>
+            <w:tcW w:w="0" w:type="auto"/>
+            <w:vAlign w:val="center"/>
+            <w:hideMark/>
+          </w:tcPr>
+          <w:p>
+            <w:r>
+              <w:t>rm1000_lung_history</w:t>
+            </w:r>
+          </w:p>
+        </w:tc>
+        <w:tc>
+          <w:tcPr>
+            <w:tcW w:w="0" w:type="auto"/>
+            <w:vAlign w:val="center"/>
+            <w:hideMark/>
+          </w:tcPr>
+          <w:p>
+            <w:r>
+              <w:t>ResNet18 (transfer)</w:t>
+            </w:r>
+          </w:p>
+        </w:tc>
+        <w:tc>
+          <w:tcPr>
+            <w:tcW w:w="0" w:type="auto"/>
+            <w:vAlign w:val="center"/>
+            <w:hideMark/>
+          </w:tcPr>
+          <w:p>
+            <w:r>
+              <w:t>0.9996</w:t>
+            </w:r>
+          </w:p>
+        </w:tc>
+        <w:tc>
+          <w:tcPr>
+            <w:tcW w:w="0" w:type="auto"/>
+            <w:vAlign w:val="center"/>
+            <w:hideMark/>
+          </w:tcPr>
+          <w:p>
+            <w:r>
+              <w:t>0.9996</w:t>
+            </w:r>
+          </w:p>
+        </w:tc>
+        <w:tc>
+          <w:tcPr>
+            <w:tcW w:w="0" w:type="auto"/>
+            <w:vAlign w:val="center"/>
+            <w:hideMark/>
+          </w:tcPr>
+          <w:p>
+            <w:r>
+              <w:t>0.9996</w:t>
+            </w:r>
+          </w:p>
+        </w:tc>
+        <w:tc>
+          <w:tcPr>
+            <w:tcW w:w="0" w:type="auto"/>
+            <w:vAlign w:val="center"/>
+            <w:hideMark/>
+          </w:tcPr>
+          <w:p>
+            <w:pPr>
+              <w:keepNext/>
+            </w:pPr>
+            <w:r>
+              <w:t>0.9996</w:t>
+            </w:r>
+          </w:p>
+        </w:tc>
+      </w:tr>
+    </w:tbl>
+    <w:p>
+      <w:pPr>
+        <w:pStyle w:val="Caption"/>
+        <w:jc w:val="center"/>
+        <w:rPr>
+          <w:color w:val="000000" w:themeColor="text1"/>
+        </w:rPr>
+      </w:pPr>
+      <w:proofErr w:type="spellStart"/>
+      <w:r>
+        <w:rPr>
+          <w:color w:val="000000" w:themeColor="text1"/>
+        </w:rPr>
+        <w:t>Tabela</w:t>
+      </w:r>
+      <w:proofErr w:type="spellEnd"/>
+      <w:r>
+        <w:rPr>
+          <w:color w:val="000000" w:themeColor="text1"/>
+        </w:rPr>
+        <w:t xml:space="preserve"> 4.1: </w:t>
+      </w:r>
+      <w:proofErr w:type="spellStart"/>
+      <w:r>
+        <w:rPr>
+          <w:color w:val="000000" w:themeColor="text1"/>
+        </w:rPr>
+        <w:t>Pregled</w:t>
+      </w:r>
+      <w:proofErr w:type="spellEnd"/>
+      <w:r>
+        <w:rPr>
+          <w:color w:val="000000" w:themeColor="text1"/>
+        </w:rPr>
+        <w:t xml:space="preserve"> baseline </w:t>
+      </w:r>
+      <w:proofErr w:type="spellStart"/>
+      <w:r>
+        <w:rPr>
+          <w:color w:val="000000" w:themeColor="text1"/>
+        </w:rPr>
+        <w:t>rezultata</w:t>
+      </w:r>
+      <w:proofErr w:type="spellEnd"/>
+      <w:r>
+        <w:rPr>
+          <w:color w:val="000000" w:themeColor="text1"/>
+        </w:rPr>
+        <w:t xml:space="preserve"> </w:t>
+      </w:r>
+      <w:r>
+        <w:rPr>
+          <w:color w:val="000000" w:themeColor="text1"/>
+        </w:rPr>
+        <w:fldChar w:fldCharType="begin"/>
+      </w:r>
+      <w:r>
+        <w:rPr>
+          <w:color w:val="000000" w:themeColor="text1"/>
+        </w:rPr>
+        <w:instrText xml:space="preserve"> SEQ Tabela_4.1:_Pregled_baseline_rezultata \* ARABIC </w:instrText>
+      </w:r>
+      <w:r>
+        <w:rPr>
+          <w:color w:val="000000" w:themeColor="text1"/>
+        </w:rPr>
+        <w:fldChar w:fldCharType="separate"/>
+      </w:r>
+      <w:r>
+        <w:rPr>
+          <w:noProof/>
+          <w:color w:val="000000" w:themeColor="text1"/>
+        </w:rPr>
+        <w:t>1</w:t>
+      </w:r>
+      <w:r>
+        <w:rPr>
+          <w:color w:val="000000" w:themeColor="text1"/>
+        </w:rPr>
+        <w:fldChar w:fldCharType="end"/>
+      </w:r>
+    </w:p>
+    <w:p/>
     <w:sectPr>
       <w:footerReference w:type="first" r:id="rId19"/>
       <w:pgSz w:w="12240" w:h="15840"/>
@@ -4915,6 +5602,25 @@
       <w:color w:val="666666"/>
     </w:rPr>
   </w:style>
+  <w:style w:type="paragraph" w:styleId="Caption">
+    <w:name w:val="caption"/>
+    <w:basedOn w:val="Normal"/>
+    <w:next w:val="Normal"/>
+    <w:uiPriority w:val="35"/>
+    <w:unhideWhenUsed/>
+    <w:qFormat/>
+    <w:rsid w:val="00095040"/>
+    <w:pPr>
+      <w:spacing w:after="200" w:line="240" w:lineRule="auto"/>
+    </w:pPr>
+    <w:rPr>
+      <w:i/>
+      <w:iCs/>
+      <w:color w:val="44546A" w:themeColor="text2"/>
+      <w:sz w:val="18"/>
+      <w:szCs w:val="18"/>
+    </w:rPr>
+  </w:style>
 </w:styles>
 </file>
 

</xml_diff>